<commit_message>
Ajustes na tabela de Agendamentos e Mensagem ao excluir
</commit_message>
<xml_diff>
--- a/STACK.docx
+++ b/STACK.docx
@@ -919,6 +919,206 @@
                 <w:lang w:val="pt-BR"/>
               </w:rPr>
               <w:t>Já vem no template do MVC, reduz necessidade de CSS extenso, responsivo para mobile</w:t>
+            </w:r>
+          </w:p>
+        </w:tc>
+      </w:tr>
+      <w:tr>
+        <w:trPr>
+          <w:trHeight w:val="445"/>
+        </w:trPr>
+        <w:tc>
+          <w:tcPr>
+            <w:tcW w:w="1786" w:type="dxa"/>
+          </w:tcPr>
+          <w:p>
+            <w:pPr>
+              <w:jc w:val="center"/>
+              <w:rPr>
+                <w:sz w:val="20"/>
+              </w:rPr>
+            </w:pPr>
+            <w:r>
+              <w:rPr>
+                <w:sz w:val="20"/>
+              </w:rPr>
+              <w:t xml:space="preserve">Bootstrap Icons</w:t>
+            </w:r>
+          </w:p>
+        </w:tc>
+        <w:tc>
+          <w:tcPr>
+            <w:tcW w:w="1153" w:type="dxa"/>
+          </w:tcPr>
+          <w:p>
+            <w:pPr>
+              <w:rPr>
+                <w:sz w:val="20"/>
+              </w:rPr>
+            </w:pPr>
+            <w:r>
+              <w:rPr>
+                <w:sz w:val="20"/>
+              </w:rPr>
+              <w:t xml:space="preserve">1.11.3</w:t>
+            </w:r>
+          </w:p>
+        </w:tc>
+        <w:tc>
+          <w:tcPr>
+            <w:tcW w:w="1412" w:type="dxa"/>
+          </w:tcPr>
+          <w:p>
+            <w:pPr>
+              <w:rPr>
+                <w:sz w:val="20"/>
+              </w:rPr>
+            </w:pPr>
+            <w:r>
+              <w:rPr>
+                <w:sz w:val="20"/>
+              </w:rPr>
+              <w:t xml:space="preserve">Frontend</w:t>
+            </w:r>
+          </w:p>
+        </w:tc>
+        <w:tc>
+          <w:tcPr>
+            <w:tcW w:w="2493" w:type="dxa"/>
+          </w:tcPr>
+          <w:p>
+            <w:pPr>
+              <w:rPr>
+                <w:sz w:val="20"/>
+                <w:lang w:val="pt-BR"/>
+              </w:rPr>
+            </w:pPr>
+            <w:r>
+              <w:rPr>
+                <w:sz w:val="20"/>
+                <w:lang w:val="pt-BR"/>
+              </w:rPr>
+              <w:t xml:space="preserve">Ícones da interface (menus, botões, status)</w:t>
+            </w:r>
+          </w:p>
+        </w:tc>
+        <w:tc>
+          <w:tcPr>
+            <w:tcW w:w="2494" w:type="dxa"/>
+          </w:tcPr>
+          <w:p>
+            <w:pPr>
+              <w:rPr>
+                <w:sz w:val="20"/>
+                <w:lang w:val="pt-BR"/>
+              </w:rPr>
+            </w:pPr>
+            <w:r>
+              <w:rPr>
+                <w:sz w:val="20"/>
+                <w:lang w:val="pt-BR"/>
+              </w:rPr>
+              <w:t xml:space="preserve">Biblioteca oficial de ícones do Bootstrap, gratuita, carregada via CDN (jsDelivr) sem instalação. Adicionada em 22/10/2026 na estilização</w:t>
+            </w:r>
+          </w:p>
+        </w:tc>
+      </w:tr>
+      <w:tr>
+        <w:trPr>
+          <w:trHeight w:val="445"/>
+        </w:trPr>
+        <w:tc>
+          <w:tcPr>
+            <w:tcW w:w="1786" w:type="dxa"/>
+          </w:tcPr>
+          <w:p>
+            <w:pPr>
+              <w:jc w:val="center"/>
+              <w:rPr>
+                <w:sz w:val="20"/>
+              </w:rPr>
+            </w:pPr>
+            <w:r>
+              <w:rPr>
+                <w:sz w:val="20"/>
+              </w:rPr>
+              <w:t xml:space="preserve">Google Fonts (Plus Jakarta Sans)</w:t>
+            </w:r>
+          </w:p>
+        </w:tc>
+        <w:tc>
+          <w:tcPr>
+            <w:tcW w:w="1153" w:type="dxa"/>
+          </w:tcPr>
+          <w:p>
+            <w:pPr>
+              <w:rPr>
+                <w:sz w:val="20"/>
+              </w:rPr>
+            </w:pPr>
+            <w:r>
+              <w:rPr>
+                <w:sz w:val="20"/>
+              </w:rPr>
+              <w:t xml:space="preserve">-</w:t>
+            </w:r>
+          </w:p>
+        </w:tc>
+        <w:tc>
+          <w:tcPr>
+            <w:tcW w:w="1412" w:type="dxa"/>
+          </w:tcPr>
+          <w:p>
+            <w:pPr>
+              <w:rPr>
+                <w:sz w:val="20"/>
+              </w:rPr>
+            </w:pPr>
+            <w:r>
+              <w:rPr>
+                <w:sz w:val="20"/>
+              </w:rPr>
+              <w:t xml:space="preserve">Frontend</w:t>
+            </w:r>
+          </w:p>
+        </w:tc>
+        <w:tc>
+          <w:tcPr>
+            <w:tcW w:w="2493" w:type="dxa"/>
+          </w:tcPr>
+          <w:p>
+            <w:pPr>
+              <w:rPr>
+                <w:sz w:val="20"/>
+                <w:lang w:val="pt-BR"/>
+              </w:rPr>
+            </w:pPr>
+            <w:r>
+              <w:rPr>
+                <w:sz w:val="20"/>
+                <w:lang w:val="pt-BR"/>
+              </w:rPr>
+              <w:t xml:space="preserve">Fonte tipográfica da identidade visual do Glowi</w:t>
+            </w:r>
+          </w:p>
+        </w:tc>
+        <w:tc>
+          <w:tcPr>
+            <w:tcW w:w="2494" w:type="dxa"/>
+          </w:tcPr>
+          <w:p>
+            <w:pPr>
+              <w:rPr>
+                <w:sz w:val="20"/>
+                <w:lang w:val="pt-BR"/>
+              </w:rPr>
+            </w:pPr>
+            <w:r>
+              <w:rPr>
+                <w:sz w:val="20"/>
+                <w:lang w:val="pt-BR"/>
+              </w:rPr>
+              <w:t xml:space="preserve">Gratuita e carregada via CDN do Google, deixa o visual moderno e legível no celular. Adicionada em 22/10/2026 na estilização</w:t>
             </w:r>
           </w:p>
         </w:tc>

</xml_diff>